<commit_message>
Update documentation, add seed data, and clean up test images
</commit_message>
<xml_diff>
--- a/Pictures/Doc1.docx
+++ b/Pictures/Doc1.docx
@@ -5,10 +5,10 @@
     <w:p>
       <w:r>
         <w:drawing>
-          <wp:inline distT="0" distB="0" distL="0" distR="0" wp14:anchorId="03624488" wp14:editId="6BEBB985">
-            <wp:extent cx="6954220" cy="8564170"/>
+          <wp:inline distT="0" distB="0" distL="0" distR="0" wp14:anchorId="0ADF83C9" wp14:editId="3BCF7230">
+            <wp:extent cx="8783276" cy="8087854"/>
             <wp:effectExtent l="0" t="0" r="0" b="8890"/>
-            <wp:docPr id="1324564417" name="Picture 1"/>
+            <wp:docPr id="1411898324" name="Picture 1"/>
             <wp:cNvGraphicFramePr>
               <a:graphicFrameLocks xmlns:a="http://schemas.openxmlformats.org/drawingml/2006/main" noChangeAspect="1"/>
             </wp:cNvGraphicFramePr>
@@ -16,7 +16,7 @@
               <a:graphicData uri="http://schemas.openxmlformats.org/drawingml/2006/picture">
                 <pic:pic xmlns:pic="http://schemas.openxmlformats.org/drawingml/2006/picture">
                   <pic:nvPicPr>
-                    <pic:cNvPr id="1324564417" name=""/>
+                    <pic:cNvPr id="1411898324" name=""/>
                     <pic:cNvPicPr/>
                   </pic:nvPicPr>
                   <pic:blipFill>
@@ -28,7 +28,7 @@
                   <pic:spPr>
                     <a:xfrm>
                       <a:off x="0" y="0"/>
-                      <a:ext cx="6954220" cy="8564170"/>
+                      <a:ext cx="8783276" cy="8087854"/>
                     </a:xfrm>
                     <a:prstGeom prst="rect">
                       <a:avLst/>
@@ -44,10 +44,10 @@
     <w:p>
       <w:r>
         <w:drawing>
-          <wp:inline distT="0" distB="0" distL="0" distR="0" wp14:anchorId="05B783D0" wp14:editId="6C487643">
-            <wp:extent cx="6763694" cy="8440328"/>
-            <wp:effectExtent l="0" t="0" r="0" b="0"/>
-            <wp:docPr id="1166687784" name="Picture 1"/>
+          <wp:inline distT="0" distB="0" distL="0" distR="0" wp14:anchorId="10AA5E58" wp14:editId="72F20DF0">
+            <wp:extent cx="8811855" cy="10126488"/>
+            <wp:effectExtent l="0" t="0" r="8890" b="8255"/>
+            <wp:docPr id="328128428" name="Picture 1"/>
             <wp:cNvGraphicFramePr>
               <a:graphicFrameLocks xmlns:a="http://schemas.openxmlformats.org/drawingml/2006/main" noChangeAspect="1"/>
             </wp:cNvGraphicFramePr>
@@ -55,7 +55,7 @@
               <a:graphicData uri="http://schemas.openxmlformats.org/drawingml/2006/picture">
                 <pic:pic xmlns:pic="http://schemas.openxmlformats.org/drawingml/2006/picture">
                   <pic:nvPicPr>
-                    <pic:cNvPr id="1166687784" name=""/>
+                    <pic:cNvPr id="328128428" name=""/>
                     <pic:cNvPicPr/>
                   </pic:nvPicPr>
                   <pic:blipFill>
@@ -67,7 +67,89 @@
                   <pic:spPr>
                     <a:xfrm>
                       <a:off x="0" y="0"/>
-                      <a:ext cx="6763694" cy="8440328"/>
+                      <a:ext cx="8811855" cy="10126488"/>
+                    </a:xfrm>
+                    <a:prstGeom prst="rect">
+                      <a:avLst/>
+                    </a:prstGeom>
+                  </pic:spPr>
+                </pic:pic>
+              </a:graphicData>
+            </a:graphic>
+          </wp:inline>
+        </w:drawing>
+      </w:r>
+      <w:r>
+        <w:br/>
+      </w:r>
+      <w:r>
+        <w:br/>
+      </w:r>
+      <w:r>
+        <w:drawing>
+          <wp:inline distT="0" distB="0" distL="0" distR="0" wp14:anchorId="62478C80" wp14:editId="6DE5F0ED">
+            <wp:extent cx="7249537" cy="8573696"/>
+            <wp:effectExtent l="0" t="0" r="8890" b="0"/>
+            <wp:docPr id="1003179228" name="Picture 1"/>
+            <wp:cNvGraphicFramePr>
+              <a:graphicFrameLocks xmlns:a="http://schemas.openxmlformats.org/drawingml/2006/main" noChangeAspect="1"/>
+            </wp:cNvGraphicFramePr>
+            <a:graphic xmlns:a="http://schemas.openxmlformats.org/drawingml/2006/main">
+              <a:graphicData uri="http://schemas.openxmlformats.org/drawingml/2006/picture">
+                <pic:pic xmlns:pic="http://schemas.openxmlformats.org/drawingml/2006/picture">
+                  <pic:nvPicPr>
+                    <pic:cNvPr id="1003179228" name=""/>
+                    <pic:cNvPicPr/>
+                  </pic:nvPicPr>
+                  <pic:blipFill>
+                    <a:blip r:embed="rId6"/>
+                    <a:stretch>
+                      <a:fillRect/>
+                    </a:stretch>
+                  </pic:blipFill>
+                  <pic:spPr>
+                    <a:xfrm>
+                      <a:off x="0" y="0"/>
+                      <a:ext cx="7249537" cy="8573696"/>
+                    </a:xfrm>
+                    <a:prstGeom prst="rect">
+                      <a:avLst/>
+                    </a:prstGeom>
+                  </pic:spPr>
+                </pic:pic>
+              </a:graphicData>
+            </a:graphic>
+          </wp:inline>
+        </w:drawing>
+      </w:r>
+    </w:p>
+    <w:p>
+      <w:r>
+        <w:drawing>
+          <wp:inline distT="0" distB="0" distL="0" distR="0" wp14:anchorId="3B53088F" wp14:editId="7B7C2ED0">
+            <wp:extent cx="8802328" cy="10155067"/>
+            <wp:effectExtent l="0" t="0" r="0" b="0"/>
+            <wp:docPr id="1400557977" name="Picture 1"/>
+            <wp:cNvGraphicFramePr>
+              <a:graphicFrameLocks xmlns:a="http://schemas.openxmlformats.org/drawingml/2006/main" noChangeAspect="1"/>
+            </wp:cNvGraphicFramePr>
+            <a:graphic xmlns:a="http://schemas.openxmlformats.org/drawingml/2006/main">
+              <a:graphicData uri="http://schemas.openxmlformats.org/drawingml/2006/picture">
+                <pic:pic xmlns:pic="http://schemas.openxmlformats.org/drawingml/2006/picture">
+                  <pic:nvPicPr>
+                    <pic:cNvPr id="1400557977" name=""/>
+                    <pic:cNvPicPr/>
+                  </pic:nvPicPr>
+                  <pic:blipFill>
+                    <a:blip r:embed="rId7"/>
+                    <a:stretch>
+                      <a:fillRect/>
+                    </a:stretch>
+                  </pic:blipFill>
+                  <pic:spPr>
+                    <a:xfrm>
+                      <a:off x="0" y="0"/>
+                      <a:ext cx="8802328" cy="10155067"/>
                     </a:xfrm>
                     <a:prstGeom prst="rect">
                       <a:avLst/>
@@ -84,10 +166,10 @@
     <w:p>
       <w:r>
         <w:drawing>
-          <wp:inline distT="0" distB="0" distL="0" distR="0" wp14:anchorId="6C722B77" wp14:editId="72FA7388">
-            <wp:extent cx="6925642" cy="8668960"/>
-            <wp:effectExtent l="0" t="0" r="8890" b="0"/>
-            <wp:docPr id="1677213052" name="Picture 1"/>
+          <wp:inline distT="0" distB="0" distL="0" distR="0" wp14:anchorId="0DCDC94B" wp14:editId="2AB007DB">
+            <wp:extent cx="8783276" cy="10459910"/>
+            <wp:effectExtent l="0" t="0" r="0" b="0"/>
+            <wp:docPr id="1033253127" name="Picture 1"/>
             <wp:cNvGraphicFramePr>
               <a:graphicFrameLocks xmlns:a="http://schemas.openxmlformats.org/drawingml/2006/main" noChangeAspect="1"/>
             </wp:cNvGraphicFramePr>
@@ -95,86 +177,7 @@
               <a:graphicData uri="http://schemas.openxmlformats.org/drawingml/2006/picture">
                 <pic:pic xmlns:pic="http://schemas.openxmlformats.org/drawingml/2006/picture">
                   <pic:nvPicPr>
-                    <pic:cNvPr id="1677213052" name=""/>
-                    <pic:cNvPicPr/>
-                  </pic:nvPicPr>
-                  <pic:blipFill>
-                    <a:blip r:embed="rId6"/>
-                    <a:stretch>
-                      <a:fillRect/>
-                    </a:stretch>
-                  </pic:blipFill>
-                  <pic:spPr>
-                    <a:xfrm>
-                      <a:off x="0" y="0"/>
-                      <a:ext cx="6925642" cy="8668960"/>
-                    </a:xfrm>
-                    <a:prstGeom prst="rect">
-                      <a:avLst/>
-                    </a:prstGeom>
-                  </pic:spPr>
-                </pic:pic>
-              </a:graphicData>
-            </a:graphic>
-          </wp:inline>
-        </w:drawing>
-      </w:r>
-    </w:p>
-    <w:p>
-      <w:r>
-        <w:drawing>
-          <wp:inline distT="0" distB="0" distL="0" distR="0" wp14:anchorId="2CE54A12" wp14:editId="73575772">
-            <wp:extent cx="7011378" cy="8621328"/>
-            <wp:effectExtent l="0" t="0" r="0" b="8890"/>
-            <wp:docPr id="758424012" name="Picture 1"/>
-            <wp:cNvGraphicFramePr>
-              <a:graphicFrameLocks xmlns:a="http://schemas.openxmlformats.org/drawingml/2006/main" noChangeAspect="1"/>
-            </wp:cNvGraphicFramePr>
-            <a:graphic xmlns:a="http://schemas.openxmlformats.org/drawingml/2006/main">
-              <a:graphicData uri="http://schemas.openxmlformats.org/drawingml/2006/picture">
-                <pic:pic xmlns:pic="http://schemas.openxmlformats.org/drawingml/2006/picture">
-                  <pic:nvPicPr>
-                    <pic:cNvPr id="758424012" name=""/>
-                    <pic:cNvPicPr/>
-                  </pic:nvPicPr>
-                  <pic:blipFill>
-                    <a:blip r:embed="rId7"/>
-                    <a:stretch>
-                      <a:fillRect/>
-                    </a:stretch>
-                  </pic:blipFill>
-                  <pic:spPr>
-                    <a:xfrm>
-                      <a:off x="0" y="0"/>
-                      <a:ext cx="7011378" cy="8621328"/>
-                    </a:xfrm>
-                    <a:prstGeom prst="rect">
-                      <a:avLst/>
-                    </a:prstGeom>
-                  </pic:spPr>
-                </pic:pic>
-              </a:graphicData>
-            </a:graphic>
-          </wp:inline>
-        </w:drawing>
-      </w:r>
-      <w:r>
-        <w:br/>
-      </w:r>
-      <w:r>
-        <w:drawing>
-          <wp:inline distT="0" distB="0" distL="0" distR="0" wp14:anchorId="34DFEE76" wp14:editId="0DCBEAC7">
-            <wp:extent cx="6935168" cy="8516539"/>
-            <wp:effectExtent l="0" t="0" r="0" b="0"/>
-            <wp:docPr id="1479063639" name="Picture 1"/>
-            <wp:cNvGraphicFramePr>
-              <a:graphicFrameLocks xmlns:a="http://schemas.openxmlformats.org/drawingml/2006/main" noChangeAspect="1"/>
-            </wp:cNvGraphicFramePr>
-            <a:graphic xmlns:a="http://schemas.openxmlformats.org/drawingml/2006/main">
-              <a:graphicData uri="http://schemas.openxmlformats.org/drawingml/2006/picture">
-                <pic:pic xmlns:pic="http://schemas.openxmlformats.org/drawingml/2006/picture">
-                  <pic:nvPicPr>
-                    <pic:cNvPr id="1479063639" name=""/>
+                    <pic:cNvPr id="1033253127" name=""/>
                     <pic:cNvPicPr/>
                   </pic:nvPicPr>
                   <pic:blipFill>
@@ -186,7 +189,7 @@
                   <pic:spPr>
                     <a:xfrm>
                       <a:off x="0" y="0"/>
-                      <a:ext cx="6935168" cy="8516539"/>
+                      <a:ext cx="8783276" cy="10459910"/>
                     </a:xfrm>
                     <a:prstGeom prst="rect">
                       <a:avLst/>
@@ -203,10 +206,10 @@
     <w:p>
       <w:r>
         <w:drawing>
-          <wp:inline distT="0" distB="0" distL="0" distR="0" wp14:anchorId="1F8E2881" wp14:editId="2BB49E6D">
-            <wp:extent cx="7011378" cy="8726118"/>
-            <wp:effectExtent l="0" t="0" r="0" b="0"/>
-            <wp:docPr id="749810725" name="Picture 1"/>
+          <wp:inline distT="0" distB="0" distL="0" distR="0" wp14:anchorId="36A54D52" wp14:editId="7E9422FE">
+            <wp:extent cx="2124371" cy="2086266"/>
+            <wp:effectExtent l="0" t="0" r="9525" b="9525"/>
+            <wp:docPr id="632577106" name="Picture 1"/>
             <wp:cNvGraphicFramePr>
               <a:graphicFrameLocks xmlns:a="http://schemas.openxmlformats.org/drawingml/2006/main" noChangeAspect="1"/>
             </wp:cNvGraphicFramePr>
@@ -214,7 +217,7 @@
               <a:graphicData uri="http://schemas.openxmlformats.org/drawingml/2006/picture">
                 <pic:pic xmlns:pic="http://schemas.openxmlformats.org/drawingml/2006/picture">
                   <pic:nvPicPr>
-                    <pic:cNvPr id="749810725" name=""/>
+                    <pic:cNvPr id="632577106" name=""/>
                     <pic:cNvPicPr/>
                   </pic:nvPicPr>
                   <pic:blipFill>
@@ -226,7 +229,7 @@
                   <pic:spPr>
                     <a:xfrm>
                       <a:off x="0" y="0"/>
-                      <a:ext cx="7011378" cy="8726118"/>
+                      <a:ext cx="2124371" cy="2086266"/>
                     </a:xfrm>
                     <a:prstGeom prst="rect">
                       <a:avLst/>
@@ -239,6 +242,8 @@
         </w:drawing>
       </w:r>
     </w:p>
+    <w:p/>
+    <w:p/>
     <w:sectPr>
       <w:pgSz w:w="12240" w:h="15840"/>
       <w:pgMar w:top="1440" w:right="1440" w:bottom="1440" w:left="1440" w:header="720" w:footer="720" w:gutter="0"/>

</xml_diff>

<commit_message>
docs: replace old screenshots and SVG mockups with live app screenshots
Deleted:
- Pictures/image1-6.png (old tray/settings screenshots)
- Pictures/mockup-*.svg (all six SVG mockups)

Updated UserManual.md:
- Sections 2, 3, 4, 6, 8 now reference live screenshots
  (screenshot-dashboard, registry, add-endpoint, notifications)

Updated ManualHowTO.md:
- All four SVG mockups replaced with live screenshots
- Add New Endpoint section includes screenshot-add-endpoint.png
- Empty-state and seed-comparison mockup image lines removed
</commit_message>
<xml_diff>
--- a/Pictures/Doc1.docx
+++ b/Pictures/Doc1.docx
@@ -4,11 +4,17 @@
   <w:body>
     <w:p>
       <w:r>
+        <w:t>Notification &amp; JSON</w:t>
+      </w:r>
+      <w:r>
+        <w:br/>
+      </w:r>
+      <w:r>
         <w:drawing>
-          <wp:inline distT="0" distB="0" distL="0" distR="0" wp14:anchorId="0ADF83C9" wp14:editId="3BCF7230">
-            <wp:extent cx="8783276" cy="8087854"/>
-            <wp:effectExtent l="0" t="0" r="0" b="8890"/>
-            <wp:docPr id="1411898324" name="Picture 1"/>
+          <wp:inline distT="0" distB="0" distL="0" distR="0" wp14:anchorId="332585EC" wp14:editId="3AEB917B">
+            <wp:extent cx="8915400" cy="10821670"/>
+            <wp:effectExtent l="0" t="0" r="0" b="0"/>
+            <wp:docPr id="607946791" name="Picture 1"/>
             <wp:cNvGraphicFramePr>
               <a:graphicFrameLocks xmlns:a="http://schemas.openxmlformats.org/drawingml/2006/main" noChangeAspect="1"/>
             </wp:cNvGraphicFramePr>
@@ -16,7 +22,7 @@
               <a:graphicData uri="http://schemas.openxmlformats.org/drawingml/2006/picture">
                 <pic:pic xmlns:pic="http://schemas.openxmlformats.org/drawingml/2006/picture">
                   <pic:nvPicPr>
-                    <pic:cNvPr id="1411898324" name=""/>
+                    <pic:cNvPr id="607946791" name=""/>
                     <pic:cNvPicPr/>
                   </pic:nvPicPr>
                   <pic:blipFill>
@@ -28,7 +34,7 @@
                   <pic:spPr>
                     <a:xfrm>
                       <a:off x="0" y="0"/>
-                      <a:ext cx="8783276" cy="8087854"/>
+                      <a:ext cx="8915599" cy="10821912"/>
                     </a:xfrm>
                     <a:prstGeom prst="rect">
                       <a:avLst/>
@@ -40,14 +46,22 @@
           </wp:inline>
         </w:drawing>
       </w:r>
-    </w:p>
-    <w:p>
+      <w:r>
+        <w:br/>
+      </w:r>
+      <w:r>
+        <w:br/>
+        <w:t>Endpoint Registry</w:t>
+      </w:r>
+      <w:r>
+        <w:br/>
+      </w:r>
       <w:r>
         <w:drawing>
-          <wp:inline distT="0" distB="0" distL="0" distR="0" wp14:anchorId="10AA5E58" wp14:editId="72F20DF0">
-            <wp:extent cx="8811855" cy="10126488"/>
-            <wp:effectExtent l="0" t="0" r="8890" b="8255"/>
-            <wp:docPr id="328128428" name="Picture 1"/>
+          <wp:inline distT="0" distB="0" distL="0" distR="0" wp14:anchorId="417D18E3" wp14:editId="258ECFCF">
+            <wp:extent cx="8877300" cy="6991985"/>
+            <wp:effectExtent l="0" t="0" r="0" b="0"/>
+            <wp:docPr id="1778477126" name="Picture 1"/>
             <wp:cNvGraphicFramePr>
               <a:graphicFrameLocks xmlns:a="http://schemas.openxmlformats.org/drawingml/2006/main" noChangeAspect="1"/>
             </wp:cNvGraphicFramePr>
@@ -55,7 +69,7 @@
               <a:graphicData uri="http://schemas.openxmlformats.org/drawingml/2006/picture">
                 <pic:pic xmlns:pic="http://schemas.openxmlformats.org/drawingml/2006/picture">
                   <pic:nvPicPr>
-                    <pic:cNvPr id="328128428" name=""/>
+                    <pic:cNvPr id="1778477126" name=""/>
                     <pic:cNvPicPr/>
                   </pic:nvPicPr>
                   <pic:blipFill>
@@ -67,7 +81,7 @@
                   <pic:spPr>
                     <a:xfrm>
                       <a:off x="0" y="0"/>
-                      <a:ext cx="8811855" cy="10126488"/>
+                      <a:ext cx="8877737" cy="6992329"/>
                     </a:xfrm>
                     <a:prstGeom prst="rect">
                       <a:avLst/>
@@ -79,18 +93,20 @@
           </wp:inline>
         </w:drawing>
       </w:r>
+    </w:p>
+    <w:p>
+      <w:r>
+        <w:t>Endpoint Registry Options</w:t>
+      </w:r>
       <w:r>
         <w:br/>
       </w:r>
       <w:r>
-        <w:br/>
-      </w:r>
-      <w:r>
         <w:drawing>
-          <wp:inline distT="0" distB="0" distL="0" distR="0" wp14:anchorId="62478C80" wp14:editId="6DE5F0ED">
-            <wp:extent cx="7249537" cy="8573696"/>
-            <wp:effectExtent l="0" t="0" r="8890" b="0"/>
-            <wp:docPr id="1003179228" name="Picture 1"/>
+          <wp:inline distT="0" distB="0" distL="0" distR="0" wp14:anchorId="08250DE0" wp14:editId="25CE317A">
+            <wp:extent cx="8772525" cy="9039860"/>
+            <wp:effectExtent l="0" t="0" r="9525" b="8890"/>
+            <wp:docPr id="1394764435" name="Picture 1"/>
             <wp:cNvGraphicFramePr>
               <a:graphicFrameLocks xmlns:a="http://schemas.openxmlformats.org/drawingml/2006/main" noChangeAspect="1"/>
             </wp:cNvGraphicFramePr>
@@ -98,7 +114,7 @@
               <a:graphicData uri="http://schemas.openxmlformats.org/drawingml/2006/picture">
                 <pic:pic xmlns:pic="http://schemas.openxmlformats.org/drawingml/2006/picture">
                   <pic:nvPicPr>
-                    <pic:cNvPr id="1003179228" name=""/>
+                    <pic:cNvPr id="1394764435" name=""/>
                     <pic:cNvPicPr/>
                   </pic:nvPicPr>
                   <pic:blipFill>
@@ -110,7 +126,7 @@
                   <pic:spPr>
                     <a:xfrm>
                       <a:off x="0" y="0"/>
-                      <a:ext cx="7249537" cy="8573696"/>
+                      <a:ext cx="8773135" cy="9040489"/>
                     </a:xfrm>
                     <a:prstGeom prst="rect">
                       <a:avLst/>
@@ -125,11 +141,17 @@
     </w:p>
     <w:p>
       <w:r>
+        <w:t>Dashboard</w:t>
+      </w:r>
+      <w:r>
+        <w:br/>
+      </w:r>
+      <w:r>
         <w:drawing>
-          <wp:inline distT="0" distB="0" distL="0" distR="0" wp14:anchorId="3B53088F" wp14:editId="7B7C2ED0">
-            <wp:extent cx="8802328" cy="10155067"/>
-            <wp:effectExtent l="0" t="0" r="0" b="0"/>
-            <wp:docPr id="1400557977" name="Picture 1"/>
+          <wp:inline distT="0" distB="0" distL="0" distR="0" wp14:anchorId="75B888A7" wp14:editId="5E509D03">
+            <wp:extent cx="9010650" cy="8887460"/>
+            <wp:effectExtent l="0" t="0" r="0" b="8890"/>
+            <wp:docPr id="481307144" name="Picture 1"/>
             <wp:cNvGraphicFramePr>
               <a:graphicFrameLocks xmlns:a="http://schemas.openxmlformats.org/drawingml/2006/main" noChangeAspect="1"/>
             </wp:cNvGraphicFramePr>
@@ -137,7 +159,7 @@
               <a:graphicData uri="http://schemas.openxmlformats.org/drawingml/2006/picture">
                 <pic:pic xmlns:pic="http://schemas.openxmlformats.org/drawingml/2006/picture">
                   <pic:nvPicPr>
-                    <pic:cNvPr id="1400557977" name=""/>
+                    <pic:cNvPr id="481307144" name=""/>
                     <pic:cNvPicPr/>
                   </pic:nvPicPr>
                   <pic:blipFill>
@@ -149,7 +171,7 @@
                   <pic:spPr>
                     <a:xfrm>
                       <a:off x="0" y="0"/>
-                      <a:ext cx="8802328" cy="10155067"/>
+                      <a:ext cx="9011266" cy="8888068"/>
                     </a:xfrm>
                     <a:prstGeom prst="rect">
                       <a:avLst/>
@@ -161,15 +183,22 @@
           </wp:inline>
         </w:drawing>
       </w:r>
-    </w:p>
-    <w:p/>
-    <w:p>
+      <w:r>
+        <w:br/>
+      </w:r>
+      <w:r>
+        <w:br/>
+        <w:t>Reports</w:t>
+      </w:r>
+      <w:r>
+        <w:br/>
+      </w:r>
       <w:r>
         <w:drawing>
-          <wp:inline distT="0" distB="0" distL="0" distR="0" wp14:anchorId="0DCDC94B" wp14:editId="2AB007DB">
-            <wp:extent cx="8783276" cy="10459910"/>
-            <wp:effectExtent l="0" t="0" r="0" b="0"/>
-            <wp:docPr id="1033253127" name="Picture 1"/>
+          <wp:inline distT="0" distB="0" distL="0" distR="0" wp14:anchorId="05CEAF19" wp14:editId="4ECF0492">
+            <wp:extent cx="9210675" cy="11907520"/>
+            <wp:effectExtent l="0" t="0" r="9525" b="0"/>
+            <wp:docPr id="575626538" name="Picture 1"/>
             <wp:cNvGraphicFramePr>
               <a:graphicFrameLocks xmlns:a="http://schemas.openxmlformats.org/drawingml/2006/main" noChangeAspect="1"/>
             </wp:cNvGraphicFramePr>
@@ -177,7 +206,7 @@
               <a:graphicData uri="http://schemas.openxmlformats.org/drawingml/2006/picture">
                 <pic:pic xmlns:pic="http://schemas.openxmlformats.org/drawingml/2006/picture">
                   <pic:nvPicPr>
-                    <pic:cNvPr id="1033253127" name=""/>
+                    <pic:cNvPr id="575626538" name=""/>
                     <pic:cNvPicPr/>
                   </pic:nvPicPr>
                   <pic:blipFill>
@@ -189,7 +218,7 @@
                   <pic:spPr>
                     <a:xfrm>
                       <a:off x="0" y="0"/>
-                      <a:ext cx="8783276" cy="10459910"/>
+                      <a:ext cx="9210978" cy="11907912"/>
                     </a:xfrm>
                     <a:prstGeom prst="rect">
                       <a:avLst/>
@@ -202,48 +231,6 @@
         </w:drawing>
       </w:r>
     </w:p>
-    <w:p/>
-    <w:p>
-      <w:r>
-        <w:drawing>
-          <wp:inline distT="0" distB="0" distL="0" distR="0" wp14:anchorId="36A54D52" wp14:editId="7E9422FE">
-            <wp:extent cx="2124371" cy="2086266"/>
-            <wp:effectExtent l="0" t="0" r="9525" b="9525"/>
-            <wp:docPr id="632577106" name="Picture 1"/>
-            <wp:cNvGraphicFramePr>
-              <a:graphicFrameLocks xmlns:a="http://schemas.openxmlformats.org/drawingml/2006/main" noChangeAspect="1"/>
-            </wp:cNvGraphicFramePr>
-            <a:graphic xmlns:a="http://schemas.openxmlformats.org/drawingml/2006/main">
-              <a:graphicData uri="http://schemas.openxmlformats.org/drawingml/2006/picture">
-                <pic:pic xmlns:pic="http://schemas.openxmlformats.org/drawingml/2006/picture">
-                  <pic:nvPicPr>
-                    <pic:cNvPr id="632577106" name=""/>
-                    <pic:cNvPicPr/>
-                  </pic:nvPicPr>
-                  <pic:blipFill>
-                    <a:blip r:embed="rId9"/>
-                    <a:stretch>
-                      <a:fillRect/>
-                    </a:stretch>
-                  </pic:blipFill>
-                  <pic:spPr>
-                    <a:xfrm>
-                      <a:off x="0" y="0"/>
-                      <a:ext cx="2124371" cy="2086266"/>
-                    </a:xfrm>
-                    <a:prstGeom prst="rect">
-                      <a:avLst/>
-                    </a:prstGeom>
-                  </pic:spPr>
-                </pic:pic>
-              </a:graphicData>
-            </a:graphic>
-          </wp:inline>
-        </w:drawing>
-      </w:r>
-    </w:p>
-    <w:p/>
-    <w:p/>
     <w:sectPr>
       <w:pgSz w:w="12240" w:h="15840"/>
       <w:pgMar w:top="1440" w:right="1440" w:bottom="1440" w:left="1440" w:header="720" w:footer="720" w:gutter="0"/>
@@ -662,7 +649,7 @@
     <w:link w:val="Heading1Char"/>
     <w:uiPriority w:val="9"/>
     <w:qFormat/>
-    <w:rsid w:val="00256D58"/>
+    <w:rsid w:val="00642252"/>
     <w:pPr>
       <w:keepNext/>
       <w:keepLines/>
@@ -685,7 +672,7 @@
     <w:semiHidden/>
     <w:unhideWhenUsed/>
     <w:qFormat/>
-    <w:rsid w:val="00256D58"/>
+    <w:rsid w:val="00642252"/>
     <w:pPr>
       <w:keepNext/>
       <w:keepLines/>
@@ -708,7 +695,7 @@
     <w:semiHidden/>
     <w:unhideWhenUsed/>
     <w:qFormat/>
-    <w:rsid w:val="00256D58"/>
+    <w:rsid w:val="00642252"/>
     <w:pPr>
       <w:keepNext/>
       <w:keepLines/>
@@ -731,7 +718,7 @@
     <w:semiHidden/>
     <w:unhideWhenUsed/>
     <w:qFormat/>
-    <w:rsid w:val="00256D58"/>
+    <w:rsid w:val="00642252"/>
     <w:pPr>
       <w:keepNext/>
       <w:keepLines/>
@@ -754,7 +741,7 @@
     <w:semiHidden/>
     <w:unhideWhenUsed/>
     <w:qFormat/>
-    <w:rsid w:val="00256D58"/>
+    <w:rsid w:val="00642252"/>
     <w:pPr>
       <w:keepNext/>
       <w:keepLines/>
@@ -775,7 +762,7 @@
     <w:semiHidden/>
     <w:unhideWhenUsed/>
     <w:qFormat/>
-    <w:rsid w:val="00256D58"/>
+    <w:rsid w:val="00642252"/>
     <w:pPr>
       <w:keepNext/>
       <w:keepLines/>
@@ -798,7 +785,7 @@
     <w:semiHidden/>
     <w:unhideWhenUsed/>
     <w:qFormat/>
-    <w:rsid w:val="00256D58"/>
+    <w:rsid w:val="00642252"/>
     <w:pPr>
       <w:keepNext/>
       <w:keepLines/>
@@ -819,7 +806,7 @@
     <w:semiHidden/>
     <w:unhideWhenUsed/>
     <w:qFormat/>
-    <w:rsid w:val="00256D58"/>
+    <w:rsid w:val="00642252"/>
     <w:pPr>
       <w:keepNext/>
       <w:keepLines/>
@@ -842,7 +829,7 @@
     <w:semiHidden/>
     <w:unhideWhenUsed/>
     <w:qFormat/>
-    <w:rsid w:val="00256D58"/>
+    <w:rsid w:val="00642252"/>
     <w:pPr>
       <w:keepNext/>
       <w:keepLines/>
@@ -886,7 +873,7 @@
     <w:basedOn w:val="DefaultParagraphFont"/>
     <w:link w:val="Heading1"/>
     <w:uiPriority w:val="9"/>
-    <w:rsid w:val="00256D58"/>
+    <w:rsid w:val="00642252"/>
     <w:rPr>
       <w:rFonts w:asciiTheme="majorHAnsi" w:eastAsiaTheme="majorEastAsia" w:hAnsiTheme="majorHAnsi" w:cstheme="majorBidi"/>
       <w:color w:val="0F4761" w:themeColor="accent1" w:themeShade="BF"/>
@@ -900,7 +887,7 @@
     <w:link w:val="Heading2"/>
     <w:uiPriority w:val="9"/>
     <w:semiHidden/>
-    <w:rsid w:val="00256D58"/>
+    <w:rsid w:val="00642252"/>
     <w:rPr>
       <w:rFonts w:asciiTheme="majorHAnsi" w:eastAsiaTheme="majorEastAsia" w:hAnsiTheme="majorHAnsi" w:cstheme="majorBidi"/>
       <w:color w:val="0F4761" w:themeColor="accent1" w:themeShade="BF"/>
@@ -914,7 +901,7 @@
     <w:link w:val="Heading3"/>
     <w:uiPriority w:val="9"/>
     <w:semiHidden/>
-    <w:rsid w:val="00256D58"/>
+    <w:rsid w:val="00642252"/>
     <w:rPr>
       <w:rFonts w:eastAsiaTheme="majorEastAsia" w:cstheme="majorBidi"/>
       <w:color w:val="0F4761" w:themeColor="accent1" w:themeShade="BF"/>
@@ -928,7 +915,7 @@
     <w:link w:val="Heading4"/>
     <w:uiPriority w:val="9"/>
     <w:semiHidden/>
-    <w:rsid w:val="00256D58"/>
+    <w:rsid w:val="00642252"/>
     <w:rPr>
       <w:rFonts w:eastAsiaTheme="majorEastAsia" w:cstheme="majorBidi"/>
       <w:i/>
@@ -942,7 +929,7 @@
     <w:link w:val="Heading5"/>
     <w:uiPriority w:val="9"/>
     <w:semiHidden/>
-    <w:rsid w:val="00256D58"/>
+    <w:rsid w:val="00642252"/>
     <w:rPr>
       <w:rFonts w:eastAsiaTheme="majorEastAsia" w:cstheme="majorBidi"/>
       <w:color w:val="0F4761" w:themeColor="accent1" w:themeShade="BF"/>
@@ -954,7 +941,7 @@
     <w:link w:val="Heading6"/>
     <w:uiPriority w:val="9"/>
     <w:semiHidden/>
-    <w:rsid w:val="00256D58"/>
+    <w:rsid w:val="00642252"/>
     <w:rPr>
       <w:rFonts w:eastAsiaTheme="majorEastAsia" w:cstheme="majorBidi"/>
       <w:i/>
@@ -968,7 +955,7 @@
     <w:link w:val="Heading7"/>
     <w:uiPriority w:val="9"/>
     <w:semiHidden/>
-    <w:rsid w:val="00256D58"/>
+    <w:rsid w:val="00642252"/>
     <w:rPr>
       <w:rFonts w:eastAsiaTheme="majorEastAsia" w:cstheme="majorBidi"/>
       <w:color w:val="595959" w:themeColor="text1" w:themeTint="A6"/>
@@ -980,7 +967,7 @@
     <w:link w:val="Heading8"/>
     <w:uiPriority w:val="9"/>
     <w:semiHidden/>
-    <w:rsid w:val="00256D58"/>
+    <w:rsid w:val="00642252"/>
     <w:rPr>
       <w:rFonts w:eastAsiaTheme="majorEastAsia" w:cstheme="majorBidi"/>
       <w:i/>
@@ -994,7 +981,7 @@
     <w:link w:val="Heading9"/>
     <w:uiPriority w:val="9"/>
     <w:semiHidden/>
-    <w:rsid w:val="00256D58"/>
+    <w:rsid w:val="00642252"/>
     <w:rPr>
       <w:rFonts w:eastAsiaTheme="majorEastAsia" w:cstheme="majorBidi"/>
       <w:color w:val="272727" w:themeColor="text1" w:themeTint="D8"/>
@@ -1007,7 +994,7 @@
     <w:link w:val="TitleChar"/>
     <w:uiPriority w:val="10"/>
     <w:qFormat/>
-    <w:rsid w:val="00256D58"/>
+    <w:rsid w:val="00642252"/>
     <w:pPr>
       <w:spacing w:after="80" w:line="240" w:lineRule="auto"/>
       <w:contextualSpacing/>
@@ -1025,7 +1012,7 @@
     <w:basedOn w:val="DefaultParagraphFont"/>
     <w:link w:val="Title"/>
     <w:uiPriority w:val="10"/>
-    <w:rsid w:val="00256D58"/>
+    <w:rsid w:val="00642252"/>
     <w:rPr>
       <w:rFonts w:asciiTheme="majorHAnsi" w:eastAsiaTheme="majorEastAsia" w:hAnsiTheme="majorHAnsi" w:cstheme="majorBidi"/>
       <w:spacing w:val="-10"/>
@@ -1041,7 +1028,7 @@
     <w:link w:val="SubtitleChar"/>
     <w:uiPriority w:val="11"/>
     <w:qFormat/>
-    <w:rsid w:val="00256D58"/>
+    <w:rsid w:val="00642252"/>
     <w:pPr>
       <w:numPr>
         <w:ilvl w:val="1"/>
@@ -1060,7 +1047,7 @@
     <w:basedOn w:val="DefaultParagraphFont"/>
     <w:link w:val="Subtitle"/>
     <w:uiPriority w:val="11"/>
-    <w:rsid w:val="00256D58"/>
+    <w:rsid w:val="00642252"/>
     <w:rPr>
       <w:rFonts w:eastAsiaTheme="majorEastAsia" w:cstheme="majorBidi"/>
       <w:color w:val="595959" w:themeColor="text1" w:themeTint="A6"/>
@@ -1076,7 +1063,7 @@
     <w:link w:val="QuoteChar"/>
     <w:uiPriority w:val="29"/>
     <w:qFormat/>
-    <w:rsid w:val="00256D58"/>
+    <w:rsid w:val="00642252"/>
     <w:pPr>
       <w:spacing w:before="160"/>
       <w:jc w:val="center"/>
@@ -1092,7 +1079,7 @@
     <w:basedOn w:val="DefaultParagraphFont"/>
     <w:link w:val="Quote"/>
     <w:uiPriority w:val="29"/>
-    <w:rsid w:val="00256D58"/>
+    <w:rsid w:val="00642252"/>
     <w:rPr>
       <w:i/>
       <w:iCs/>
@@ -1104,7 +1091,7 @@
     <w:basedOn w:val="Normal"/>
     <w:uiPriority w:val="34"/>
     <w:qFormat/>
-    <w:rsid w:val="00256D58"/>
+    <w:rsid w:val="00642252"/>
     <w:pPr>
       <w:ind w:left="720"/>
       <w:contextualSpacing/>
@@ -1115,7 +1102,7 @@
     <w:basedOn w:val="DefaultParagraphFont"/>
     <w:uiPriority w:val="21"/>
     <w:qFormat/>
-    <w:rsid w:val="00256D58"/>
+    <w:rsid w:val="00642252"/>
     <w:rPr>
       <w:i/>
       <w:iCs/>
@@ -1129,7 +1116,7 @@
     <w:link w:val="IntenseQuoteChar"/>
     <w:uiPriority w:val="30"/>
     <w:qFormat/>
-    <w:rsid w:val="00256D58"/>
+    <w:rsid w:val="00642252"/>
     <w:pPr>
       <w:pBdr>
         <w:top w:val="single" w:sz="4" w:space="10" w:color="0F4761" w:themeColor="accent1" w:themeShade="BF"/>
@@ -1150,7 +1137,7 @@
     <w:basedOn w:val="DefaultParagraphFont"/>
     <w:link w:val="IntenseQuote"/>
     <w:uiPriority w:val="30"/>
-    <w:rsid w:val="00256D58"/>
+    <w:rsid w:val="00642252"/>
     <w:rPr>
       <w:i/>
       <w:iCs/>
@@ -1162,7 +1149,7 @@
     <w:basedOn w:val="DefaultParagraphFont"/>
     <w:uiPriority w:val="32"/>
     <w:qFormat/>
-    <w:rsid w:val="00256D58"/>
+    <w:rsid w:val="00642252"/>
     <w:rPr>
       <w:b/>
       <w:bCs/>

</xml_diff>